<commit_message>
Updated Power BI report and RTO Word document with latest changes
</commit_message>
<xml_diff>
--- a/shiprocket_rto_report.docx
+++ b/shiprocket_rto_report.docx
@@ -114,27 +114,37 @@
         <w:rPr>
           <w:color w:val="6B7280"/>
         </w:rPr>
-        <w:t xml:space="preserve">    </w:t>
+        <w:t xml:space="preserve">  Ship</w:t>
       </w:r>
-      <w:proofErr w:type="spellStart"/>
       <w:r>
         <w:rPr>
           <w:color w:val="6B7280"/>
         </w:rPr>
-        <w:t>Shiprocket</w:t>
+        <w:t>r</w:t>
       </w:r>
-      <w:proofErr w:type="spellEnd"/>
+      <w:r>
+        <w:rPr>
+          <w:color w:val="6B7280"/>
+        </w:rPr>
+        <w:t>ocket</w:t>
+      </w:r>
     </w:p>
     <w:p>
       <w:pPr>
         <w:spacing w:after="360"/>
-        <w:jc w:val="center"/>
+        <w:ind w:left="4320"/>
       </w:pPr>
       <w:r>
         <w:rPr>
           <w:color w:val="6B7280"/>
         </w:rPr>
-        <w:t>July 2026</w:t>
+        <w:t xml:space="preserve">    April</w:t>
+      </w:r>
+      <w:r>
+        <w:rPr>
+          <w:color w:val="6B7280"/>
+        </w:rPr>
+        <w:t xml:space="preserve"> 2026</w:t>
       </w:r>
     </w:p>
     <w:p>
@@ -168,12 +178,6 @@
         <w:gridCol w:w="9360"/>
       </w:tblGrid>
       <w:tr>
-        <w:tblPrEx>
-          <w:tblCellMar>
-            <w:top w:w="0" w:type="dxa"/>
-            <w:bottom w:w="0" w:type="dxa"/>
-          </w:tblCellMar>
-        </w:tblPrEx>
         <w:tc>
           <w:tcPr>
             <w:tcW w:w="9360" w:type="dxa"/>
@@ -243,12 +247,6 @@
         <w:gridCol w:w="9360"/>
       </w:tblGrid>
       <w:tr>
-        <w:tblPrEx>
-          <w:tblCellMar>
-            <w:top w:w="0" w:type="dxa"/>
-            <w:bottom w:w="0" w:type="dxa"/>
-          </w:tblCellMar>
-        </w:tblPrEx>
         <w:tc>
           <w:tcPr>
             <w:tcW w:w="9360" w:type="dxa"/>
@@ -296,13 +294,8 @@
           <w:bottom w:val="single" w:sz="6" w:space="4" w:color="2563EB"/>
         </w:pBdr>
       </w:pPr>
-      <w:proofErr w:type="gramStart"/>
       <w:r>
-        <w:t>1.1  Why</w:t>
-      </w:r>
-      <w:proofErr w:type="gramEnd"/>
-      <w:r>
-        <w:t xml:space="preserve"> RTO Is </w:t>
+        <w:t xml:space="preserve">1.1  Why RTO Is </w:t>
       </w:r>
       <w:proofErr w:type="spellStart"/>
       <w:r>
@@ -353,12 +346,6 @@
         <w:gridCol w:w="2340"/>
       </w:tblGrid>
       <w:tr>
-        <w:tblPrEx>
-          <w:tblCellMar>
-            <w:top w:w="0" w:type="dxa"/>
-            <w:bottom w:w="0" w:type="dxa"/>
-          </w:tblCellMar>
-        </w:tblPrEx>
         <w:tc>
           <w:tcPr>
             <w:tcW w:w="2340" w:type="dxa"/>
@@ -659,21 +646,7 @@
         <w:rPr>
           <w:color w:val="374151"/>
         </w:rPr>
-        <w:t xml:space="preserve">At scale, this translates to significant financial exposure. For every ₹10 lakh GMV shipped via </w:t>
-      </w:r>
-      <w:proofErr w:type="spellStart"/>
-      <w:r>
-        <w:rPr>
-          <w:color w:val="374151"/>
-        </w:rPr>
-        <w:t>Shiprocket</w:t>
-      </w:r>
-      <w:proofErr w:type="spellEnd"/>
-      <w:r>
-        <w:rPr>
-          <w:color w:val="374151"/>
-        </w:rPr>
-        <w:t>, RTO losses approximate ₹80,000–1,20,000 per month, before COD remittance delays (8–10+ days) are factored in as a working capital cost on top.</w:t>
+        <w:t>At scale, this translates to significant financial exposure. For every ₹10 lakh GMV shipped via Shiprocket, RTO losses approximate ₹80,000–1,20,000 per month, before COD remittance delays (8–10+ days) are factored in as a working capital cost on top.</w:t>
       </w:r>
     </w:p>
     <w:p>
@@ -688,13 +661,8 @@
           <w:bottom w:val="single" w:sz="6" w:space="4" w:color="2563EB"/>
         </w:pBdr>
       </w:pPr>
-      <w:proofErr w:type="gramStart"/>
       <w:r>
-        <w:t>1.2  Root</w:t>
-      </w:r>
-      <w:proofErr w:type="gramEnd"/>
-      <w:r>
-        <w:t xml:space="preserve"> Cause Taxonomy</w:t>
+        <w:t>1.2  Root Cause Taxonomy</w:t>
       </w:r>
     </w:p>
     <w:p>
@@ -737,12 +705,6 @@
         <w:gridCol w:w="2960"/>
       </w:tblGrid>
       <w:tr>
-        <w:tblPrEx>
-          <w:tblCellMar>
-            <w:top w:w="0" w:type="dxa"/>
-            <w:bottom w:w="0" w:type="dxa"/>
-          </w:tblCellMar>
-        </w:tblPrEx>
         <w:trPr>
           <w:tblHeader/>
         </w:trPr>
@@ -880,12 +842,6 @@
         </w:tc>
       </w:tr>
       <w:tr>
-        <w:tblPrEx>
-          <w:tblCellMar>
-            <w:top w:w="0" w:type="dxa"/>
-            <w:bottom w:w="0" w:type="dxa"/>
-          </w:tblCellMar>
-        </w:tblPrEx>
         <w:tc>
           <w:tcPr>
             <w:tcW w:w="2000" w:type="dxa"/>
@@ -1000,12 +956,6 @@
         </w:tc>
       </w:tr>
       <w:tr>
-        <w:tblPrEx>
-          <w:tblCellMar>
-            <w:top w:w="0" w:type="dxa"/>
-            <w:bottom w:w="0" w:type="dxa"/>
-          </w:tblCellMar>
-        </w:tblPrEx>
         <w:tc>
           <w:tcPr>
             <w:tcW w:w="2000" w:type="dxa"/>
@@ -1120,12 +1070,6 @@
         </w:tc>
       </w:tr>
       <w:tr>
-        <w:tblPrEx>
-          <w:tblCellMar>
-            <w:top w:w="0" w:type="dxa"/>
-            <w:bottom w:w="0" w:type="dxa"/>
-          </w:tblCellMar>
-        </w:tblPrEx>
         <w:tc>
           <w:tcPr>
             <w:tcW w:w="2000" w:type="dxa"/>
@@ -1240,12 +1184,6 @@
         </w:tc>
       </w:tr>
       <w:tr>
-        <w:tblPrEx>
-          <w:tblCellMar>
-            <w:top w:w="0" w:type="dxa"/>
-            <w:bottom w:w="0" w:type="dxa"/>
-          </w:tblCellMar>
-        </w:tblPrEx>
         <w:tc>
           <w:tcPr>
             <w:tcW w:w="2000" w:type="dxa"/>
@@ -1360,12 +1298,6 @@
         </w:tc>
       </w:tr>
       <w:tr>
-        <w:tblPrEx>
-          <w:tblCellMar>
-            <w:top w:w="0" w:type="dxa"/>
-            <w:bottom w:w="0" w:type="dxa"/>
-          </w:tblCellMar>
-        </w:tblPrEx>
         <w:tc>
           <w:tcPr>
             <w:tcW w:w="2000" w:type="dxa"/>
@@ -1506,12 +1438,6 @@
         <w:gridCol w:w="9360"/>
       </w:tblGrid>
       <w:tr>
-        <w:tblPrEx>
-          <w:tblCellMar>
-            <w:top w:w="0" w:type="dxa"/>
-            <w:bottom w:w="0" w:type="dxa"/>
-          </w:tblCellMar>
-        </w:tblPrEx>
         <w:tc>
           <w:tcPr>
             <w:tcW w:w="9360" w:type="dxa"/>
@@ -1582,12 +1508,6 @@
         <w:gridCol w:w="9360"/>
       </w:tblGrid>
       <w:tr>
-        <w:tblPrEx>
-          <w:tblCellMar>
-            <w:top w:w="0" w:type="dxa"/>
-            <w:bottom w:w="0" w:type="dxa"/>
-          </w:tblCellMar>
-        </w:tblPrEx>
         <w:tc>
           <w:tcPr>
             <w:tcW w:w="9360" w:type="dxa"/>
@@ -1635,13 +1555,8 @@
           <w:bottom w:val="single" w:sz="6" w:space="4" w:color="2563EB"/>
         </w:pBdr>
       </w:pPr>
-      <w:proofErr w:type="gramStart"/>
       <w:r>
-        <w:t>2.1  Nine</w:t>
-      </w:r>
-      <w:proofErr w:type="gramEnd"/>
-      <w:r>
-        <w:t>-Stage Journey Map with Pain Point Attribution</w:t>
+        <w:t>2.1  Nine-Stage Journey Map with Pain Point Attribution</w:t>
       </w:r>
     </w:p>
     <w:p>
@@ -1666,21 +1581,7 @@
         <w:rPr>
           <w:color w:val="374151"/>
         </w:rPr>
-        <w:t xml:space="preserve"> was constructed to identify which stages generate which root causes. This matters because most existing </w:t>
-      </w:r>
-      <w:proofErr w:type="spellStart"/>
-      <w:r>
-        <w:rPr>
-          <w:color w:val="374151"/>
-        </w:rPr>
-        <w:t>Shiprocket</w:t>
-      </w:r>
-      <w:proofErr w:type="spellEnd"/>
-      <w:r>
-        <w:rPr>
-          <w:color w:val="374151"/>
-        </w:rPr>
-        <w:t xml:space="preserve"> products (RADAR, </w:t>
+        <w:t xml:space="preserve"> was constructed to identify which stages generate which root causes. This matters because most existing Shiprocket products (RADAR, </w:t>
       </w:r>
       <w:proofErr w:type="spellStart"/>
       <w:r>
@@ -1727,12 +1628,6 @@
         <w:gridCol w:w="2166"/>
       </w:tblGrid>
       <w:tr>
-        <w:tblPrEx>
-          <w:tblCellMar>
-            <w:top w:w="0" w:type="dxa"/>
-            <w:bottom w:w="0" w:type="dxa"/>
-          </w:tblCellMar>
-        </w:tblPrEx>
         <w:trPr>
           <w:tblHeader/>
         </w:trPr>
@@ -1889,7 +1784,6 @@
             <w:pPr>
               <w:jc w:val="center"/>
             </w:pPr>
-            <w:proofErr w:type="spellStart"/>
             <w:r>
               <w:rPr>
                 <w:b/>
@@ -1898,29 +1792,12 @@
                 <w:sz w:val="20"/>
                 <w:szCs w:val="20"/>
               </w:rPr>
-              <w:t>Shiprocket</w:t>
-            </w:r>
-            <w:proofErr w:type="spellEnd"/>
-            <w:r>
-              <w:rPr>
-                <w:b/>
-                <w:bCs/>
-                <w:color w:val="FFFFFF"/>
-                <w:sz w:val="20"/>
-                <w:szCs w:val="20"/>
-              </w:rPr>
-              <w:t xml:space="preserve"> Influence</w:t>
+              <w:t>Shiprocket Influence</w:t>
             </w:r>
           </w:p>
         </w:tc>
       </w:tr>
       <w:tr>
-        <w:tblPrEx>
-          <w:tblCellMar>
-            <w:top w:w="0" w:type="dxa"/>
-            <w:bottom w:w="0" w:type="dxa"/>
-          </w:tblCellMar>
-        </w:tblPrEx>
         <w:tc>
           <w:tcPr>
             <w:tcW w:w="1600" w:type="dxa"/>
@@ -2063,12 +1940,6 @@
         </w:tc>
       </w:tr>
       <w:tr>
-        <w:tblPrEx>
-          <w:tblCellMar>
-            <w:top w:w="0" w:type="dxa"/>
-            <w:bottom w:w="0" w:type="dxa"/>
-          </w:tblCellMar>
-        </w:tblPrEx>
         <w:tc>
           <w:tcPr>
             <w:tcW w:w="1600" w:type="dxa"/>
@@ -2211,12 +2082,6 @@
         </w:tc>
       </w:tr>
       <w:tr>
-        <w:tblPrEx>
-          <w:tblCellMar>
-            <w:top w:w="0" w:type="dxa"/>
-            <w:bottom w:w="0" w:type="dxa"/>
-          </w:tblCellMar>
-        </w:tblPrEx>
         <w:tc>
           <w:tcPr>
             <w:tcW w:w="1600" w:type="dxa"/>
@@ -2359,12 +2224,6 @@
         </w:tc>
       </w:tr>
       <w:tr>
-        <w:tblPrEx>
-          <w:tblCellMar>
-            <w:top w:w="0" w:type="dxa"/>
-            <w:bottom w:w="0" w:type="dxa"/>
-          </w:tblCellMar>
-        </w:tblPrEx>
         <w:tc>
           <w:tcPr>
             <w:tcW w:w="1600" w:type="dxa"/>
@@ -2507,12 +2366,6 @@
         </w:tc>
       </w:tr>
       <w:tr>
-        <w:tblPrEx>
-          <w:tblCellMar>
-            <w:top w:w="0" w:type="dxa"/>
-            <w:bottom w:w="0" w:type="dxa"/>
-          </w:tblCellMar>
-        </w:tblPrEx>
         <w:tc>
           <w:tcPr>
             <w:tcW w:w="1600" w:type="dxa"/>
@@ -2673,12 +2526,6 @@
         </w:tc>
       </w:tr>
       <w:tr>
-        <w:tblPrEx>
-          <w:tblCellMar>
-            <w:top w:w="0" w:type="dxa"/>
-            <w:bottom w:w="0" w:type="dxa"/>
-          </w:tblCellMar>
-        </w:tblPrEx>
         <w:tc>
           <w:tcPr>
             <w:tcW w:w="1600" w:type="dxa"/>
@@ -2821,12 +2668,6 @@
         </w:tc>
       </w:tr>
       <w:tr>
-        <w:tblPrEx>
-          <w:tblCellMar>
-            <w:top w:w="0" w:type="dxa"/>
-            <w:bottom w:w="0" w:type="dxa"/>
-          </w:tblCellMar>
-        </w:tblPrEx>
         <w:tc>
           <w:tcPr>
             <w:tcW w:w="1600" w:type="dxa"/>
@@ -2969,12 +2810,6 @@
         </w:tc>
       </w:tr>
       <w:tr>
-        <w:tblPrEx>
-          <w:tblCellMar>
-            <w:top w:w="0" w:type="dxa"/>
-            <w:bottom w:w="0" w:type="dxa"/>
-          </w:tblCellMar>
-        </w:tblPrEx>
         <w:tc>
           <w:tcPr>
             <w:tcW w:w="1600" w:type="dxa"/>
@@ -3117,12 +2952,6 @@
         </w:tc>
       </w:tr>
       <w:tr>
-        <w:tblPrEx>
-          <w:tblCellMar>
-            <w:top w:w="0" w:type="dxa"/>
-            <w:bottom w:w="0" w:type="dxa"/>
-          </w:tblCellMar>
-        </w:tblPrEx>
         <w:tc>
           <w:tcPr>
             <w:tcW w:w="1600" w:type="dxa"/>
@@ -3298,25 +3127,7 @@
           <w:iCs/>
           <w:color w:val="6B7280"/>
         </w:rPr>
-        <w:t xml:space="preserve"> data perimeter for most sellers (who run their own Shopify/website checkout). Pain points at those stages are real but are framed here as context, not as actionable </w:t>
-      </w:r>
-      <w:proofErr w:type="spellStart"/>
-      <w:r>
-        <w:rPr>
-          <w:i/>
-          <w:iCs/>
-          <w:color w:val="6B7280"/>
-        </w:rPr>
-        <w:t>Shiprocket</w:t>
-      </w:r>
-      <w:proofErr w:type="spellEnd"/>
-      <w:r>
-        <w:rPr>
-          <w:i/>
-          <w:iCs/>
-          <w:color w:val="6B7280"/>
-        </w:rPr>
-        <w:t xml:space="preserve"> features, to maintain analytical honesty about the platform's actual surface area.</w:t>
+        <w:t xml:space="preserve"> data perimeter for most sellers (who run their own Shopify/website checkout). Pain points at those stages are real but are framed here as context, not as actionable Shiprocket features, to maintain analytical honesty about the platform's actual surface area.</w:t>
       </w:r>
     </w:p>
     <w:p>
@@ -3345,12 +3156,6 @@
         <w:gridCol w:w="9360"/>
       </w:tblGrid>
       <w:tr>
-        <w:tblPrEx>
-          <w:tblCellMar>
-            <w:top w:w="0" w:type="dxa"/>
-            <w:bottom w:w="0" w:type="dxa"/>
-          </w:tblCellMar>
-        </w:tblPrEx>
         <w:tc>
           <w:tcPr>
             <w:tcW w:w="9360" w:type="dxa"/>
@@ -3398,13 +3203,8 @@
           <w:bottom w:val="single" w:sz="6" w:space="4" w:color="2563EB"/>
         </w:pBdr>
       </w:pPr>
-      <w:proofErr w:type="gramStart"/>
       <w:r>
-        <w:t>3.1  Ghost</w:t>
-      </w:r>
-      <w:proofErr w:type="gramEnd"/>
-      <w:r>
-        <w:t xml:space="preserve"> Customer Deterrence System</w:t>
+        <w:t>3.1  Ghost Customer Deterrence System</w:t>
       </w:r>
     </w:p>
     <w:p>
@@ -3422,13 +3222,8 @@
       <w:pPr>
         <w:pStyle w:val="Heading3"/>
       </w:pPr>
-      <w:proofErr w:type="gramStart"/>
       <w:r>
-        <w:t>3.1.1  Phone</w:t>
-      </w:r>
-      <w:proofErr w:type="gramEnd"/>
-      <w:r>
-        <w:t xml:space="preserve"> Number OTP Verification at Checkout</w:t>
+        <w:t>3.1.1  Phone Number OTP Verification at Checkout</w:t>
       </w:r>
     </w:p>
     <w:p>
@@ -3446,13 +3241,8 @@
       <w:pPr>
         <w:pStyle w:val="Heading3"/>
       </w:pPr>
-      <w:proofErr w:type="gramStart"/>
       <w:r>
-        <w:t>3.1.2  Risk</w:t>
-      </w:r>
-      <w:proofErr w:type="gramEnd"/>
-      <w:r>
-        <w:t>-Scaled Refundable Deposit (Prepaid Orders)</w:t>
+        <w:t>3.1.2  Risk-Scaled Refundable Deposit (Prepaid Orders)</w:t>
       </w:r>
     </w:p>
     <w:p>
@@ -3484,13 +3274,8 @@
       <w:pPr>
         <w:pStyle w:val="Heading3"/>
       </w:pPr>
-      <w:proofErr w:type="gramStart"/>
       <w:r>
-        <w:t>3.1.3  COD</w:t>
-      </w:r>
-      <w:proofErr w:type="gramEnd"/>
-      <w:r>
-        <w:t xml:space="preserve"> Friction Surcharge (COD Orders)</w:t>
+        <w:t>3.1.3  COD Friction Surcharge (COD Orders)</w:t>
       </w:r>
     </w:p>
     <w:p>
@@ -3525,12 +3310,6 @@
         <w:gridCol w:w="9360"/>
       </w:tblGrid>
       <w:tr>
-        <w:tblPrEx>
-          <w:tblCellMar>
-            <w:top w:w="0" w:type="dxa"/>
-            <w:bottom w:w="0" w:type="dxa"/>
-          </w:tblCellMar>
-        </w:tblPrEx>
         <w:tc>
           <w:tcPr>
             <w:tcW w:w="9360" w:type="dxa"/>
@@ -3604,13 +3383,8 @@
           <w:bottom w:val="single" w:sz="6" w:space="4" w:color="2563EB"/>
         </w:pBdr>
       </w:pPr>
-      <w:proofErr w:type="gramStart"/>
       <w:r>
-        <w:t>3.2  Pre</w:t>
-      </w:r>
-      <w:proofErr w:type="gramEnd"/>
-      <w:r>
-        <w:t>-Delivery Engagement &amp; Neighbour Delivery (NDR Reduction)</w:t>
+        <w:t>3.2  Pre-Delivery Engagement &amp; Neighbour Delivery (NDR Reduction)</w:t>
       </w:r>
     </w:p>
     <w:p>
@@ -3689,13 +3463,8 @@
           <w:bottom w:val="single" w:sz="6" w:space="4" w:color="2563EB"/>
         </w:pBdr>
       </w:pPr>
-      <w:proofErr w:type="gramStart"/>
       <w:r>
-        <w:t>3.3  Address</w:t>
-      </w:r>
-      <w:proofErr w:type="gramEnd"/>
-      <w:r>
-        <w:t xml:space="preserve"> Quality: Pin-Drop Default</w:t>
+        <w:t>3.3  Address Quality: Pin-Drop Default</w:t>
       </w:r>
     </w:p>
     <w:p>
@@ -3721,13 +3490,8 @@
           <w:bottom w:val="single" w:sz="6" w:space="4" w:color="2563EB"/>
         </w:pBdr>
       </w:pPr>
-      <w:proofErr w:type="gramStart"/>
       <w:r>
-        <w:t>3.4  Listing</w:t>
-      </w:r>
-      <w:proofErr w:type="gramEnd"/>
-      <w:r>
-        <w:t xml:space="preserve"> Quality Signal (Return Rate Reduction)</w:t>
+        <w:t>3.4  Listing Quality Signal (Return Rate Reduction)</w:t>
       </w:r>
     </w:p>
     <w:p>
@@ -3738,21 +3502,7 @@
         <w:rPr>
           <w:color w:val="374151"/>
         </w:rPr>
-        <w:t xml:space="preserve">Post-delivery returns are a separate funnel from RTOs but are often conflated in seller dashboards. The actionable </w:t>
-      </w:r>
-      <w:proofErr w:type="spellStart"/>
-      <w:r>
-        <w:rPr>
-          <w:color w:val="374151"/>
-        </w:rPr>
-        <w:t>Shiprocket</w:t>
-      </w:r>
-      <w:proofErr w:type="spellEnd"/>
-      <w:r>
-        <w:rPr>
-          <w:color w:val="374151"/>
-        </w:rPr>
-        <w:t xml:space="preserve"> feature here is not "mandate better photography" (outside </w:t>
+        <w:t xml:space="preserve">Post-delivery returns are a separate funnel from RTOs but are often conflated in seller dashboards. The actionable Shiprocket feature here is not "mandate better photography" (outside </w:t>
       </w:r>
       <w:proofErr w:type="spellStart"/>
       <w:r>
@@ -3766,21 +3516,7 @@
         <w:rPr>
           <w:color w:val="374151"/>
         </w:rPr>
-        <w:t xml:space="preserve"> control) but rather a listing-level analytics signal: flag SKUs where post-delivery return rate is meaningfully above the category baseline, cross-referenced against a binary listing-quality proxy (has customer-uploaded photos / has size chart present). This gives sellers a prioritised to-do list without requiring </w:t>
-      </w:r>
-      <w:proofErr w:type="spellStart"/>
-      <w:r>
-        <w:rPr>
-          <w:color w:val="374151"/>
-        </w:rPr>
-        <w:t>Shiprocket</w:t>
-      </w:r>
-      <w:proofErr w:type="spellEnd"/>
-      <w:r>
-        <w:rPr>
-          <w:color w:val="374151"/>
-        </w:rPr>
-        <w:t xml:space="preserve"> to operate a content review function.</w:t>
+        <w:t xml:space="preserve"> control) but rather a listing-level analytics signal: flag SKUs where post-delivery return rate is meaningfully above the category baseline, cross-referenced against a binary listing-quality proxy (has customer-uploaded photos / has size chart present). This gives sellers a prioritised to-do list without requiring Shiprocket to operate a content review function.</w:t>
       </w:r>
     </w:p>
     <w:p>
@@ -3809,12 +3545,6 @@
         <w:gridCol w:w="9360"/>
       </w:tblGrid>
       <w:tr>
-        <w:tblPrEx>
-          <w:tblCellMar>
-            <w:top w:w="0" w:type="dxa"/>
-            <w:bottom w:w="0" w:type="dxa"/>
-          </w:tblCellMar>
-        </w:tblPrEx>
         <w:tc>
           <w:tcPr>
             <w:tcW w:w="9360" w:type="dxa"/>
@@ -3862,13 +3592,8 @@
           <w:bottom w:val="single" w:sz="6" w:space="4" w:color="2563EB"/>
         </w:pBdr>
       </w:pPr>
-      <w:proofErr w:type="gramStart"/>
       <w:r>
-        <w:t>4.1  Design</w:t>
-      </w:r>
-      <w:proofErr w:type="gramEnd"/>
-      <w:r>
-        <w:t xml:space="preserve"> Philosophy</w:t>
+        <w:t>4.1  Design Philosophy</w:t>
       </w:r>
     </w:p>
     <w:p>
@@ -3879,21 +3604,7 @@
         <w:rPr>
           <w:color w:val="374151"/>
         </w:rPr>
-        <w:t xml:space="preserve">Real </w:t>
-      </w:r>
-      <w:proofErr w:type="spellStart"/>
-      <w:r>
-        <w:rPr>
-          <w:color w:val="374151"/>
-        </w:rPr>
-        <w:t>Shiprocket</w:t>
-      </w:r>
-      <w:proofErr w:type="spellEnd"/>
-      <w:r>
-        <w:rPr>
-          <w:color w:val="374151"/>
-        </w:rPr>
-        <w:t xml:space="preserve"> order data is not publicly available. Rather than using a generic e-commerce Kaggle dataset (which would embed assumptions foreign to Indian logistics), a custom simulation was built in Python to generate a dataset calibrated to the specific statistical signatures documented in Section 1. The simulation generates 50,000 customer profiles</w:t>
+        <w:t>Real Shiprocket order data is not publicly available. Rather than using a generic e-commerce Kaggle dataset (which would embed assumptions foreign to Indian logistics), a custom simulation was built in Python to generate a dataset calibrated to the specific statistical signatures documented in Section 1. The simulation generates 50,000 customer profiles</w:t>
       </w:r>
       <w:r>
         <w:rPr>
@@ -3923,12 +3634,6 @@
         <w:gridCol w:w="9360"/>
       </w:tblGrid>
       <w:tr>
-        <w:tblPrEx>
-          <w:tblCellMar>
-            <w:top w:w="0" w:type="dxa"/>
-            <w:bottom w:w="0" w:type="dxa"/>
-          </w:tblCellMar>
-        </w:tblPrEx>
         <w:tc>
           <w:tcPr>
             <w:tcW w:w="9360" w:type="dxa"/>
@@ -3984,13 +3689,8 @@
           <w:bottom w:val="single" w:sz="6" w:space="4" w:color="2563EB"/>
         </w:pBdr>
       </w:pPr>
-      <w:proofErr w:type="gramStart"/>
       <w:r>
-        <w:t>4.2  Customer</w:t>
-      </w:r>
-      <w:proofErr w:type="gramEnd"/>
-      <w:r>
-        <w:t xml:space="preserve"> Persona Architecture</w:t>
+        <w:t>4.2  Customer Persona Architecture</w:t>
       </w:r>
     </w:p>
     <w:p>
@@ -4035,12 +3735,6 @@
         <w:gridCol w:w="2657"/>
       </w:tblGrid>
       <w:tr>
-        <w:tblPrEx>
-          <w:tblCellMar>
-            <w:top w:w="0" w:type="dxa"/>
-            <w:bottom w:w="0" w:type="dxa"/>
-          </w:tblCellMar>
-        </w:tblPrEx>
         <w:trPr>
           <w:tblHeader/>
         </w:trPr>
@@ -4244,12 +3938,6 @@
         </w:tc>
       </w:tr>
       <w:tr>
-        <w:tblPrEx>
-          <w:tblCellMar>
-            <w:top w:w="0" w:type="dxa"/>
-            <w:bottom w:w="0" w:type="dxa"/>
-          </w:tblCellMar>
-        </w:tblPrEx>
         <w:tc>
           <w:tcPr>
             <w:tcW w:w="2100" w:type="dxa"/>
@@ -4420,12 +4108,6 @@
         </w:tc>
       </w:tr>
       <w:tr>
-        <w:tblPrEx>
-          <w:tblCellMar>
-            <w:top w:w="0" w:type="dxa"/>
-            <w:bottom w:w="0" w:type="dxa"/>
-          </w:tblCellMar>
-        </w:tblPrEx>
         <w:tc>
           <w:tcPr>
             <w:tcW w:w="2100" w:type="dxa"/>
@@ -4596,12 +4278,6 @@
         </w:tc>
       </w:tr>
       <w:tr>
-        <w:tblPrEx>
-          <w:tblCellMar>
-            <w:top w:w="0" w:type="dxa"/>
-            <w:bottom w:w="0" w:type="dxa"/>
-          </w:tblCellMar>
-        </w:tblPrEx>
         <w:tc>
           <w:tcPr>
             <w:tcW w:w="2100" w:type="dxa"/>
@@ -4772,12 +4448,6 @@
         </w:tc>
       </w:tr>
       <w:tr>
-        <w:tblPrEx>
-          <w:tblCellMar>
-            <w:top w:w="0" w:type="dxa"/>
-            <w:bottom w:w="0" w:type="dxa"/>
-          </w:tblCellMar>
-        </w:tblPrEx>
         <w:tc>
           <w:tcPr>
             <w:tcW w:w="2100" w:type="dxa"/>
@@ -4948,12 +4618,6 @@
         </w:tc>
       </w:tr>
       <w:tr>
-        <w:tblPrEx>
-          <w:tblCellMar>
-            <w:top w:w="0" w:type="dxa"/>
-            <w:bottom w:w="0" w:type="dxa"/>
-          </w:tblCellMar>
-        </w:tblPrEx>
         <w:tc>
           <w:tcPr>
             <w:tcW w:w="2100" w:type="dxa"/>
@@ -5124,12 +4788,6 @@
         </w:tc>
       </w:tr>
       <w:tr>
-        <w:tblPrEx>
-          <w:tblCellMar>
-            <w:top w:w="0" w:type="dxa"/>
-            <w:bottom w:w="0" w:type="dxa"/>
-          </w:tblCellMar>
-        </w:tblPrEx>
         <w:tc>
           <w:tcPr>
             <w:tcW w:w="2100" w:type="dxa"/>
@@ -5300,12 +4958,6 @@
         </w:tc>
       </w:tr>
       <w:tr>
-        <w:tblPrEx>
-          <w:tblCellMar>
-            <w:top w:w="0" w:type="dxa"/>
-            <w:bottom w:w="0" w:type="dxa"/>
-          </w:tblCellMar>
-        </w:tblPrEx>
         <w:tc>
           <w:tcPr>
             <w:tcW w:w="2100" w:type="dxa"/>
@@ -5506,13 +5158,8 @@
           <w:bottom w:val="single" w:sz="6" w:space="4" w:color="2563EB"/>
         </w:pBdr>
       </w:pPr>
-      <w:proofErr w:type="gramStart"/>
       <w:r>
-        <w:t>4.3  Two</w:t>
-      </w:r>
-      <w:proofErr w:type="gramEnd"/>
-      <w:r>
-        <w:t>-Gate Risk Architecture</w:t>
+        <w:t>4.3  Two-Gate Risk Architecture</w:t>
       </w:r>
     </w:p>
     <w:p>
@@ -5557,12 +5204,6 @@
         <w:gridCol w:w="1960"/>
       </w:tblGrid>
       <w:tr>
-        <w:tblPrEx>
-          <w:tblCellMar>
-            <w:top w:w="0" w:type="dxa"/>
-            <w:bottom w:w="0" w:type="dxa"/>
-          </w:tblCellMar>
-        </w:tblPrEx>
         <w:trPr>
           <w:tblHeader/>
         </w:trPr>
@@ -5733,12 +5374,6 @@
         </w:tc>
       </w:tr>
       <w:tr>
-        <w:tblPrEx>
-          <w:tblCellMar>
-            <w:top w:w="0" w:type="dxa"/>
-            <w:bottom w:w="0" w:type="dxa"/>
-          </w:tblCellMar>
-        </w:tblPrEx>
         <w:tc>
           <w:tcPr>
             <w:tcW w:w="1000" w:type="dxa"/>
@@ -5881,12 +5516,6 @@
         </w:tc>
       </w:tr>
       <w:tr>
-        <w:tblPrEx>
-          <w:tblCellMar>
-            <w:top w:w="0" w:type="dxa"/>
-            <w:bottom w:w="0" w:type="dxa"/>
-          </w:tblCellMar>
-        </w:tblPrEx>
         <w:tc>
           <w:tcPr>
             <w:tcW w:w="1000" w:type="dxa"/>
@@ -6055,12 +5684,6 @@
         <w:gridCol w:w="9360"/>
       </w:tblGrid>
       <w:tr>
-        <w:tblPrEx>
-          <w:tblCellMar>
-            <w:top w:w="0" w:type="dxa"/>
-            <w:bottom w:w="0" w:type="dxa"/>
-          </w:tblCellMar>
-        </w:tblPrEx>
         <w:tc>
           <w:tcPr>
             <w:tcW w:w="9360" w:type="dxa"/>
@@ -6134,13 +5757,8 @@
           <w:bottom w:val="single" w:sz="6" w:space="4" w:color="2563EB"/>
         </w:pBdr>
       </w:pPr>
-      <w:proofErr w:type="gramStart"/>
       <w:r>
-        <w:t>4.4  Ghost</w:t>
-      </w:r>
-      <w:proofErr w:type="gramEnd"/>
-      <w:r>
-        <w:t xml:space="preserve"> Customer Detection Logic</w:t>
+        <w:t>4.4  Ghost Customer Detection Logic</w:t>
       </w:r>
     </w:p>
     <w:p>
@@ -6267,12 +5885,6 @@
         <w:gridCol w:w="9360"/>
       </w:tblGrid>
       <w:tr>
-        <w:tblPrEx>
-          <w:tblCellMar>
-            <w:top w:w="0" w:type="dxa"/>
-            <w:bottom w:w="0" w:type="dxa"/>
-          </w:tblCellMar>
-        </w:tblPrEx>
         <w:tc>
           <w:tcPr>
             <w:tcW w:w="9360" w:type="dxa"/>
@@ -6320,13 +5932,8 @@
           <w:bottom w:val="single" w:sz="6" w:space="4" w:color="2563EB"/>
         </w:pBdr>
       </w:pPr>
-      <w:proofErr w:type="gramStart"/>
       <w:r>
-        <w:t>5.1  Dashboard</w:t>
-      </w:r>
-      <w:proofErr w:type="gramEnd"/>
-      <w:r>
-        <w:t xml:space="preserve"> Architecture</w:t>
+        <w:t>5.1  Dashboard Architecture</w:t>
       </w:r>
     </w:p>
     <w:p>
@@ -6364,13 +5971,8 @@
           <w:bottom w:val="single" w:sz="6" w:space="4" w:color="2563EB"/>
         </w:pBdr>
       </w:pPr>
-      <w:proofErr w:type="gramStart"/>
       <w:r>
-        <w:t>5.2  Key</w:t>
-      </w:r>
-      <w:proofErr w:type="gramEnd"/>
-      <w:r>
-        <w:t xml:space="preserve"> Findings by Dashboard Page</w:t>
+        <w:t>5.2  Key Findings by Dashboard Page</w:t>
       </w:r>
     </w:p>
     <w:p>
@@ -6407,12 +6009,6 @@
         <w:gridCol w:w="3120"/>
       </w:tblGrid>
       <w:tr>
-        <w:tblPrEx>
-          <w:tblCellMar>
-            <w:top w:w="0" w:type="dxa"/>
-            <w:bottom w:w="0" w:type="dxa"/>
-          </w:tblCellMar>
-        </w:tblPrEx>
         <w:tc>
           <w:tcPr>
             <w:tcW w:w="3120" w:type="dxa"/>
@@ -6639,12 +6235,6 @@
         <w:gridCol w:w="2340"/>
       </w:tblGrid>
       <w:tr>
-        <w:tblPrEx>
-          <w:tblCellMar>
-            <w:top w:w="0" w:type="dxa"/>
-            <w:bottom w:w="0" w:type="dxa"/>
-          </w:tblCellMar>
-        </w:tblPrEx>
         <w:trPr>
           <w:tblHeader/>
         </w:trPr>
@@ -6782,12 +6372,6 @@
         </w:tc>
       </w:tr>
       <w:tr>
-        <w:tblPrEx>
-          <w:tblCellMar>
-            <w:top w:w="0" w:type="dxa"/>
-            <w:bottom w:w="0" w:type="dxa"/>
-          </w:tblCellMar>
-        </w:tblPrEx>
         <w:tc>
           <w:tcPr>
             <w:tcW w:w="2340" w:type="dxa"/>
@@ -6908,12 +6492,6 @@
         </w:tc>
       </w:tr>
       <w:tr>
-        <w:tblPrEx>
-          <w:tblCellMar>
-            <w:top w:w="0" w:type="dxa"/>
-            <w:bottom w:w="0" w:type="dxa"/>
-          </w:tblCellMar>
-        </w:tblPrEx>
         <w:tc>
           <w:tcPr>
             <w:tcW w:w="2340" w:type="dxa"/>
@@ -7028,12 +6606,6 @@
         </w:tc>
       </w:tr>
       <w:tr>
-        <w:tblPrEx>
-          <w:tblCellMar>
-            <w:top w:w="0" w:type="dxa"/>
-            <w:bottom w:w="0" w:type="dxa"/>
-          </w:tblCellMar>
-        </w:tblPrEx>
         <w:tc>
           <w:tcPr>
             <w:tcW w:w="2340" w:type="dxa"/>
@@ -7148,12 +6720,6 @@
         </w:tc>
       </w:tr>
       <w:tr>
-        <w:tblPrEx>
-          <w:tblCellMar>
-            <w:top w:w="0" w:type="dxa"/>
-            <w:bottom w:w="0" w:type="dxa"/>
-          </w:tblCellMar>
-        </w:tblPrEx>
         <w:tc>
           <w:tcPr>
             <w:tcW w:w="2340" w:type="dxa"/>
@@ -7359,12 +6925,6 @@
         <w:gridCol w:w="9360"/>
       </w:tblGrid>
       <w:tr>
-        <w:tblPrEx>
-          <w:tblCellMar>
-            <w:top w:w="0" w:type="dxa"/>
-            <w:bottom w:w="0" w:type="dxa"/>
-          </w:tblCellMar>
-        </w:tblPrEx>
         <w:tc>
           <w:tcPr>
             <w:tcW w:w="9360" w:type="dxa"/>
@@ -7437,12 +6997,6 @@
         <w:gridCol w:w="2340"/>
       </w:tblGrid>
       <w:tr>
-        <w:tblPrEx>
-          <w:tblCellMar>
-            <w:top w:w="0" w:type="dxa"/>
-            <w:bottom w:w="0" w:type="dxa"/>
-          </w:tblCellMar>
-        </w:tblPrEx>
         <w:tc>
           <w:tcPr>
             <w:tcW w:w="2340" w:type="dxa"/>
@@ -7747,12 +7301,6 @@
         <w:gridCol w:w="3120"/>
       </w:tblGrid>
       <w:tr>
-        <w:tblPrEx>
-          <w:tblCellMar>
-            <w:top w:w="0" w:type="dxa"/>
-            <w:bottom w:w="0" w:type="dxa"/>
-          </w:tblCellMar>
-        </w:tblPrEx>
         <w:tc>
           <w:tcPr>
             <w:tcW w:w="3120" w:type="dxa"/>
@@ -7992,21 +7540,7 @@
         <w:rPr>
           <w:color w:val="374151"/>
         </w:rPr>
-        <w:t xml:space="preserve">The gauge visual shows current COD RTO rate at 0.18 (coincidentally at the target) — this is because the simulation's persona mix is calibrated to slightly below India's real-world benchmark. In a real deployment with actual </w:t>
-      </w:r>
-      <w:proofErr w:type="spellStart"/>
-      <w:r>
-        <w:rPr>
-          <w:color w:val="374151"/>
-        </w:rPr>
-        <w:t>Shiprocket</w:t>
-      </w:r>
-      <w:proofErr w:type="spellEnd"/>
-      <w:r>
-        <w:rPr>
-          <w:color w:val="374151"/>
-        </w:rPr>
-        <w:t xml:space="preserve"> data, the COD RTO rate would read 20–30% for most seller cohorts, making the savings figure materially larger. The model structure is correct; the calibration is a function of persona weights, which are documented and adjustable.</w:t>
+        <w:t>The gauge visual shows current COD RTO rate at 0.18 (coincidentally at the target) — this is because the simulation's persona mix is calibrated to slightly below India's real-world benchmark. In a real deployment with actual Shiprocket data, the COD RTO rate would read 20–30% for most seller cohorts, making the savings figure materially larger. The model structure is correct; the calibration is a function of persona weights, which are documented and adjustable.</w:t>
       </w:r>
     </w:p>
     <w:p>
@@ -8095,12 +7629,6 @@
         <w:gridCol w:w="9360"/>
       </w:tblGrid>
       <w:tr>
-        <w:tblPrEx>
-          <w:tblCellMar>
-            <w:top w:w="0" w:type="dxa"/>
-            <w:bottom w:w="0" w:type="dxa"/>
-          </w:tblCellMar>
-        </w:tblPrEx>
         <w:tc>
           <w:tcPr>
             <w:tcW w:w="9360" w:type="dxa"/>
@@ -8148,13 +7676,8 @@
           <w:bottom w:val="single" w:sz="6" w:space="4" w:color="2563EB"/>
         </w:pBdr>
       </w:pPr>
-      <w:proofErr w:type="gramStart"/>
       <w:r>
-        <w:t>6.1  Overview</w:t>
-      </w:r>
-      <w:proofErr w:type="gramEnd"/>
-      <w:r>
-        <w:t xml:space="preserve"> of Test Programme</w:t>
+        <w:t>6.1  Overview of Test Programme</w:t>
       </w:r>
     </w:p>
     <w:p>
@@ -8206,12 +7729,6 @@
         <w:gridCol w:w="6760"/>
       </w:tblGrid>
       <w:tr>
-        <w:tblPrEx>
-          <w:tblCellMar>
-            <w:top w:w="0" w:type="dxa"/>
-            <w:bottom w:w="0" w:type="dxa"/>
-          </w:tblCellMar>
-        </w:tblPrEx>
         <w:trPr>
           <w:tblHeader/>
         </w:trPr>
@@ -8283,12 +7800,6 @@
         </w:tc>
       </w:tr>
       <w:tr>
-        <w:tblPrEx>
-          <w:tblCellMar>
-            <w:top w:w="0" w:type="dxa"/>
-            <w:bottom w:w="0" w:type="dxa"/>
-          </w:tblCellMar>
-        </w:tblPrEx>
         <w:tc>
           <w:tcPr>
             <w:tcW w:w="2600" w:type="dxa"/>
@@ -8347,12 +7858,6 @@
         </w:tc>
       </w:tr>
       <w:tr>
-        <w:tblPrEx>
-          <w:tblCellMar>
-            <w:top w:w="0" w:type="dxa"/>
-            <w:bottom w:w="0" w:type="dxa"/>
-          </w:tblCellMar>
-        </w:tblPrEx>
         <w:tc>
           <w:tcPr>
             <w:tcW w:w="2600" w:type="dxa"/>
@@ -8411,12 +7916,6 @@
         </w:tc>
       </w:tr>
       <w:tr>
-        <w:tblPrEx>
-          <w:tblCellMar>
-            <w:top w:w="0" w:type="dxa"/>
-            <w:bottom w:w="0" w:type="dxa"/>
-          </w:tblCellMar>
-        </w:tblPrEx>
         <w:tc>
           <w:tcPr>
             <w:tcW w:w="2600" w:type="dxa"/>
@@ -8475,12 +7974,6 @@
         </w:tc>
       </w:tr>
       <w:tr>
-        <w:tblPrEx>
-          <w:tblCellMar>
-            <w:top w:w="0" w:type="dxa"/>
-            <w:bottom w:w="0" w:type="dxa"/>
-          </w:tblCellMar>
-        </w:tblPrEx>
         <w:tc>
           <w:tcPr>
             <w:tcW w:w="2600" w:type="dxa"/>
@@ -8539,12 +8032,6 @@
         </w:tc>
       </w:tr>
       <w:tr>
-        <w:tblPrEx>
-          <w:tblCellMar>
-            <w:top w:w="0" w:type="dxa"/>
-            <w:bottom w:w="0" w:type="dxa"/>
-          </w:tblCellMar>
-        </w:tblPrEx>
         <w:tc>
           <w:tcPr>
             <w:tcW w:w="2600" w:type="dxa"/>
@@ -8603,12 +8090,6 @@
         </w:tc>
       </w:tr>
       <w:tr>
-        <w:tblPrEx>
-          <w:tblCellMar>
-            <w:top w:w="0" w:type="dxa"/>
-            <w:bottom w:w="0" w:type="dxa"/>
-          </w:tblCellMar>
-        </w:tblPrEx>
         <w:tc>
           <w:tcPr>
             <w:tcW w:w="2600" w:type="dxa"/>
@@ -8667,12 +8148,6 @@
         </w:tc>
       </w:tr>
       <w:tr>
-        <w:tblPrEx>
-          <w:tblCellMar>
-            <w:top w:w="0" w:type="dxa"/>
-            <w:bottom w:w="0" w:type="dxa"/>
-          </w:tblCellMar>
-        </w:tblPrEx>
         <w:tc>
           <w:tcPr>
             <w:tcW w:w="2600" w:type="dxa"/>
@@ -8731,12 +8206,6 @@
         </w:tc>
       </w:tr>
       <w:tr>
-        <w:tblPrEx>
-          <w:tblCellMar>
-            <w:top w:w="0" w:type="dxa"/>
-            <w:bottom w:w="0" w:type="dxa"/>
-          </w:tblCellMar>
-        </w:tblPrEx>
         <w:tc>
           <w:tcPr>
             <w:tcW w:w="2600" w:type="dxa"/>
@@ -8795,12 +8264,6 @@
         </w:tc>
       </w:tr>
       <w:tr>
-        <w:tblPrEx>
-          <w:tblCellMar>
-            <w:top w:w="0" w:type="dxa"/>
-            <w:bottom w:w="0" w:type="dxa"/>
-          </w:tblCellMar>
-        </w:tblPrEx>
         <w:tc>
           <w:tcPr>
             <w:tcW w:w="2600" w:type="dxa"/>
@@ -8859,12 +8322,6 @@
         </w:tc>
       </w:tr>
       <w:tr>
-        <w:tblPrEx>
-          <w:tblCellMar>
-            <w:top w:w="0" w:type="dxa"/>
-            <w:bottom w:w="0" w:type="dxa"/>
-          </w:tblCellMar>
-        </w:tblPrEx>
         <w:tc>
           <w:tcPr>
             <w:tcW w:w="2600" w:type="dxa"/>
@@ -8923,12 +8380,6 @@
         </w:tc>
       </w:tr>
       <w:tr>
-        <w:tblPrEx>
-          <w:tblCellMar>
-            <w:top w:w="0" w:type="dxa"/>
-            <w:bottom w:w="0" w:type="dxa"/>
-          </w:tblCellMar>
-        </w:tblPrEx>
         <w:tc>
           <w:tcPr>
             <w:tcW w:w="2600" w:type="dxa"/>
@@ -8987,12 +8438,6 @@
         </w:tc>
       </w:tr>
       <w:tr>
-        <w:tblPrEx>
-          <w:tblCellMar>
-            <w:top w:w="0" w:type="dxa"/>
-            <w:bottom w:w="0" w:type="dxa"/>
-          </w:tblCellMar>
-        </w:tblPrEx>
         <w:tc>
           <w:tcPr>
             <w:tcW w:w="2600" w:type="dxa"/>
@@ -9051,12 +8496,6 @@
         </w:tc>
       </w:tr>
       <w:tr>
-        <w:tblPrEx>
-          <w:tblCellMar>
-            <w:top w:w="0" w:type="dxa"/>
-            <w:bottom w:w="0" w:type="dxa"/>
-          </w:tblCellMar>
-        </w:tblPrEx>
         <w:tc>
           <w:tcPr>
             <w:tcW w:w="2600" w:type="dxa"/>
@@ -9115,12 +8554,6 @@
         </w:tc>
       </w:tr>
       <w:tr>
-        <w:tblPrEx>
-          <w:tblCellMar>
-            <w:top w:w="0" w:type="dxa"/>
-            <w:bottom w:w="0" w:type="dxa"/>
-          </w:tblCellMar>
-        </w:tblPrEx>
         <w:tc>
           <w:tcPr>
             <w:tcW w:w="2600" w:type="dxa"/>
@@ -9179,12 +8612,6 @@
         </w:tc>
       </w:tr>
       <w:tr>
-        <w:tblPrEx>
-          <w:tblCellMar>
-            <w:top w:w="0" w:type="dxa"/>
-            <w:bottom w:w="0" w:type="dxa"/>
-          </w:tblCellMar>
-        </w:tblPrEx>
         <w:tc>
           <w:tcPr>
             <w:tcW w:w="2600" w:type="dxa"/>
@@ -9281,12 +8708,6 @@
         <w:gridCol w:w="6760"/>
       </w:tblGrid>
       <w:tr>
-        <w:tblPrEx>
-          <w:tblCellMar>
-            <w:top w:w="0" w:type="dxa"/>
-            <w:bottom w:w="0" w:type="dxa"/>
-          </w:tblCellMar>
-        </w:tblPrEx>
         <w:trPr>
           <w:tblHeader/>
         </w:trPr>
@@ -9358,12 +8779,6 @@
         </w:tc>
       </w:tr>
       <w:tr>
-        <w:tblPrEx>
-          <w:tblCellMar>
-            <w:top w:w="0" w:type="dxa"/>
-            <w:bottom w:w="0" w:type="dxa"/>
-          </w:tblCellMar>
-        </w:tblPrEx>
         <w:tc>
           <w:tcPr>
             <w:tcW w:w="2600" w:type="dxa"/>
@@ -9422,12 +8837,6 @@
         </w:tc>
       </w:tr>
       <w:tr>
-        <w:tblPrEx>
-          <w:tblCellMar>
-            <w:top w:w="0" w:type="dxa"/>
-            <w:bottom w:w="0" w:type="dxa"/>
-          </w:tblCellMar>
-        </w:tblPrEx>
         <w:tc>
           <w:tcPr>
             <w:tcW w:w="2600" w:type="dxa"/>
@@ -9486,12 +8895,6 @@
         </w:tc>
       </w:tr>
       <w:tr>
-        <w:tblPrEx>
-          <w:tblCellMar>
-            <w:top w:w="0" w:type="dxa"/>
-            <w:bottom w:w="0" w:type="dxa"/>
-          </w:tblCellMar>
-        </w:tblPrEx>
         <w:tc>
           <w:tcPr>
             <w:tcW w:w="2600" w:type="dxa"/>
@@ -9550,12 +8953,6 @@
         </w:tc>
       </w:tr>
       <w:tr>
-        <w:tblPrEx>
-          <w:tblCellMar>
-            <w:top w:w="0" w:type="dxa"/>
-            <w:bottom w:w="0" w:type="dxa"/>
-          </w:tblCellMar>
-        </w:tblPrEx>
         <w:tc>
           <w:tcPr>
             <w:tcW w:w="2600" w:type="dxa"/>
@@ -9614,12 +9011,6 @@
         </w:tc>
       </w:tr>
       <w:tr>
-        <w:tblPrEx>
-          <w:tblCellMar>
-            <w:top w:w="0" w:type="dxa"/>
-            <w:bottom w:w="0" w:type="dxa"/>
-          </w:tblCellMar>
-        </w:tblPrEx>
         <w:tc>
           <w:tcPr>
             <w:tcW w:w="2600" w:type="dxa"/>
@@ -9678,12 +9069,6 @@
         </w:tc>
       </w:tr>
       <w:tr>
-        <w:tblPrEx>
-          <w:tblCellMar>
-            <w:top w:w="0" w:type="dxa"/>
-            <w:bottom w:w="0" w:type="dxa"/>
-          </w:tblCellMar>
-        </w:tblPrEx>
         <w:tc>
           <w:tcPr>
             <w:tcW w:w="2600" w:type="dxa"/>
@@ -9742,12 +9127,6 @@
         </w:tc>
       </w:tr>
       <w:tr>
-        <w:tblPrEx>
-          <w:tblCellMar>
-            <w:top w:w="0" w:type="dxa"/>
-            <w:bottom w:w="0" w:type="dxa"/>
-          </w:tblCellMar>
-        </w:tblPrEx>
         <w:tc>
           <w:tcPr>
             <w:tcW w:w="2600" w:type="dxa"/>
@@ -9806,12 +9185,6 @@
         </w:tc>
       </w:tr>
       <w:tr>
-        <w:tblPrEx>
-          <w:tblCellMar>
-            <w:top w:w="0" w:type="dxa"/>
-            <w:bottom w:w="0" w:type="dxa"/>
-          </w:tblCellMar>
-        </w:tblPrEx>
         <w:tc>
           <w:tcPr>
             <w:tcW w:w="2600" w:type="dxa"/>
@@ -9870,12 +9243,6 @@
         </w:tc>
       </w:tr>
       <w:tr>
-        <w:tblPrEx>
-          <w:tblCellMar>
-            <w:top w:w="0" w:type="dxa"/>
-            <w:bottom w:w="0" w:type="dxa"/>
-          </w:tblCellMar>
-        </w:tblPrEx>
         <w:tc>
           <w:tcPr>
             <w:tcW w:w="2600" w:type="dxa"/>
@@ -9934,12 +9301,6 @@
         </w:tc>
       </w:tr>
       <w:tr>
-        <w:tblPrEx>
-          <w:tblCellMar>
-            <w:top w:w="0" w:type="dxa"/>
-            <w:bottom w:w="0" w:type="dxa"/>
-          </w:tblCellMar>
-        </w:tblPrEx>
         <w:tc>
           <w:tcPr>
             <w:tcW w:w="2600" w:type="dxa"/>
@@ -9998,12 +9359,6 @@
         </w:tc>
       </w:tr>
       <w:tr>
-        <w:tblPrEx>
-          <w:tblCellMar>
-            <w:top w:w="0" w:type="dxa"/>
-            <w:bottom w:w="0" w:type="dxa"/>
-          </w:tblCellMar>
-        </w:tblPrEx>
         <w:tc>
           <w:tcPr>
             <w:tcW w:w="2600" w:type="dxa"/>
@@ -10062,12 +9417,6 @@
         </w:tc>
       </w:tr>
       <w:tr>
-        <w:tblPrEx>
-          <w:tblCellMar>
-            <w:top w:w="0" w:type="dxa"/>
-            <w:bottom w:w="0" w:type="dxa"/>
-          </w:tblCellMar>
-        </w:tblPrEx>
         <w:tc>
           <w:tcPr>
             <w:tcW w:w="2600" w:type="dxa"/>
@@ -10126,12 +9475,6 @@
         </w:tc>
       </w:tr>
       <w:tr>
-        <w:tblPrEx>
-          <w:tblCellMar>
-            <w:top w:w="0" w:type="dxa"/>
-            <w:bottom w:w="0" w:type="dxa"/>
-          </w:tblCellMar>
-        </w:tblPrEx>
         <w:tc>
           <w:tcPr>
             <w:tcW w:w="2600" w:type="dxa"/>
@@ -10190,12 +9533,6 @@
         </w:tc>
       </w:tr>
       <w:tr>
-        <w:tblPrEx>
-          <w:tblCellMar>
-            <w:top w:w="0" w:type="dxa"/>
-            <w:bottom w:w="0" w:type="dxa"/>
-          </w:tblCellMar>
-        </w:tblPrEx>
         <w:tc>
           <w:tcPr>
             <w:tcW w:w="2600" w:type="dxa"/>
@@ -10254,12 +9591,6 @@
         </w:tc>
       </w:tr>
       <w:tr>
-        <w:tblPrEx>
-          <w:tblCellMar>
-            <w:top w:w="0" w:type="dxa"/>
-            <w:bottom w:w="0" w:type="dxa"/>
-          </w:tblCellMar>
-        </w:tblPrEx>
         <w:tc>
           <w:tcPr>
             <w:tcW w:w="2600" w:type="dxa"/>
@@ -10356,12 +9687,6 @@
         <w:gridCol w:w="6760"/>
       </w:tblGrid>
       <w:tr>
-        <w:tblPrEx>
-          <w:tblCellMar>
-            <w:top w:w="0" w:type="dxa"/>
-            <w:bottom w:w="0" w:type="dxa"/>
-          </w:tblCellMar>
-        </w:tblPrEx>
         <w:trPr>
           <w:tblHeader/>
         </w:trPr>
@@ -10433,12 +9758,6 @@
         </w:tc>
       </w:tr>
       <w:tr>
-        <w:tblPrEx>
-          <w:tblCellMar>
-            <w:top w:w="0" w:type="dxa"/>
-            <w:bottom w:w="0" w:type="dxa"/>
-          </w:tblCellMar>
-        </w:tblPrEx>
         <w:tc>
           <w:tcPr>
             <w:tcW w:w="2600" w:type="dxa"/>
@@ -10497,12 +9816,6 @@
         </w:tc>
       </w:tr>
       <w:tr>
-        <w:tblPrEx>
-          <w:tblCellMar>
-            <w:top w:w="0" w:type="dxa"/>
-            <w:bottom w:w="0" w:type="dxa"/>
-          </w:tblCellMar>
-        </w:tblPrEx>
         <w:tc>
           <w:tcPr>
             <w:tcW w:w="2600" w:type="dxa"/>
@@ -10561,12 +9874,6 @@
         </w:tc>
       </w:tr>
       <w:tr>
-        <w:tblPrEx>
-          <w:tblCellMar>
-            <w:top w:w="0" w:type="dxa"/>
-            <w:bottom w:w="0" w:type="dxa"/>
-          </w:tblCellMar>
-        </w:tblPrEx>
         <w:tc>
           <w:tcPr>
             <w:tcW w:w="2600" w:type="dxa"/>
@@ -10626,12 +9933,6 @@
         </w:tc>
       </w:tr>
       <w:tr>
-        <w:tblPrEx>
-          <w:tblCellMar>
-            <w:top w:w="0" w:type="dxa"/>
-            <w:bottom w:w="0" w:type="dxa"/>
-          </w:tblCellMar>
-        </w:tblPrEx>
         <w:tc>
           <w:tcPr>
             <w:tcW w:w="2600" w:type="dxa"/>
@@ -10690,12 +9991,6 @@
         </w:tc>
       </w:tr>
       <w:tr>
-        <w:tblPrEx>
-          <w:tblCellMar>
-            <w:top w:w="0" w:type="dxa"/>
-            <w:bottom w:w="0" w:type="dxa"/>
-          </w:tblCellMar>
-        </w:tblPrEx>
         <w:tc>
           <w:tcPr>
             <w:tcW w:w="2600" w:type="dxa"/>
@@ -10754,12 +10049,6 @@
         </w:tc>
       </w:tr>
       <w:tr>
-        <w:tblPrEx>
-          <w:tblCellMar>
-            <w:top w:w="0" w:type="dxa"/>
-            <w:bottom w:w="0" w:type="dxa"/>
-          </w:tblCellMar>
-        </w:tblPrEx>
         <w:tc>
           <w:tcPr>
             <w:tcW w:w="2600" w:type="dxa"/>
@@ -10818,12 +10107,6 @@
         </w:tc>
       </w:tr>
       <w:tr>
-        <w:tblPrEx>
-          <w:tblCellMar>
-            <w:top w:w="0" w:type="dxa"/>
-            <w:bottom w:w="0" w:type="dxa"/>
-          </w:tblCellMar>
-        </w:tblPrEx>
         <w:tc>
           <w:tcPr>
             <w:tcW w:w="2600" w:type="dxa"/>
@@ -10882,12 +10165,6 @@
         </w:tc>
       </w:tr>
       <w:tr>
-        <w:tblPrEx>
-          <w:tblCellMar>
-            <w:top w:w="0" w:type="dxa"/>
-            <w:bottom w:w="0" w:type="dxa"/>
-          </w:tblCellMar>
-        </w:tblPrEx>
         <w:tc>
           <w:tcPr>
             <w:tcW w:w="2600" w:type="dxa"/>
@@ -10946,12 +10223,6 @@
         </w:tc>
       </w:tr>
       <w:tr>
-        <w:tblPrEx>
-          <w:tblCellMar>
-            <w:top w:w="0" w:type="dxa"/>
-            <w:bottom w:w="0" w:type="dxa"/>
-          </w:tblCellMar>
-        </w:tblPrEx>
         <w:tc>
           <w:tcPr>
             <w:tcW w:w="2600" w:type="dxa"/>
@@ -11010,12 +10281,6 @@
         </w:tc>
       </w:tr>
       <w:tr>
-        <w:tblPrEx>
-          <w:tblCellMar>
-            <w:top w:w="0" w:type="dxa"/>
-            <w:bottom w:w="0" w:type="dxa"/>
-          </w:tblCellMar>
-        </w:tblPrEx>
         <w:tc>
           <w:tcPr>
             <w:tcW w:w="2600" w:type="dxa"/>
@@ -11074,12 +10339,6 @@
         </w:tc>
       </w:tr>
       <w:tr>
-        <w:tblPrEx>
-          <w:tblCellMar>
-            <w:top w:w="0" w:type="dxa"/>
-            <w:bottom w:w="0" w:type="dxa"/>
-          </w:tblCellMar>
-        </w:tblPrEx>
         <w:tc>
           <w:tcPr>
             <w:tcW w:w="2600" w:type="dxa"/>
@@ -11138,12 +10397,6 @@
         </w:tc>
       </w:tr>
       <w:tr>
-        <w:tblPrEx>
-          <w:tblCellMar>
-            <w:top w:w="0" w:type="dxa"/>
-            <w:bottom w:w="0" w:type="dxa"/>
-          </w:tblCellMar>
-        </w:tblPrEx>
         <w:tc>
           <w:tcPr>
             <w:tcW w:w="2600" w:type="dxa"/>
@@ -11240,12 +10493,6 @@
         <w:gridCol w:w="6760"/>
       </w:tblGrid>
       <w:tr>
-        <w:tblPrEx>
-          <w:tblCellMar>
-            <w:top w:w="0" w:type="dxa"/>
-            <w:bottom w:w="0" w:type="dxa"/>
-          </w:tblCellMar>
-        </w:tblPrEx>
         <w:trPr>
           <w:tblHeader/>
         </w:trPr>
@@ -11317,12 +10564,6 @@
         </w:tc>
       </w:tr>
       <w:tr>
-        <w:tblPrEx>
-          <w:tblCellMar>
-            <w:top w:w="0" w:type="dxa"/>
-            <w:bottom w:w="0" w:type="dxa"/>
-          </w:tblCellMar>
-        </w:tblPrEx>
         <w:tc>
           <w:tcPr>
             <w:tcW w:w="2600" w:type="dxa"/>
@@ -11381,12 +10622,6 @@
         </w:tc>
       </w:tr>
       <w:tr>
-        <w:tblPrEx>
-          <w:tblCellMar>
-            <w:top w:w="0" w:type="dxa"/>
-            <w:bottom w:w="0" w:type="dxa"/>
-          </w:tblCellMar>
-        </w:tblPrEx>
         <w:tc>
           <w:tcPr>
             <w:tcW w:w="2600" w:type="dxa"/>
@@ -11445,12 +10680,6 @@
         </w:tc>
       </w:tr>
       <w:tr>
-        <w:tblPrEx>
-          <w:tblCellMar>
-            <w:top w:w="0" w:type="dxa"/>
-            <w:bottom w:w="0" w:type="dxa"/>
-          </w:tblCellMar>
-        </w:tblPrEx>
         <w:tc>
           <w:tcPr>
             <w:tcW w:w="2600" w:type="dxa"/>
@@ -11509,12 +10738,6 @@
         </w:tc>
       </w:tr>
       <w:tr>
-        <w:tblPrEx>
-          <w:tblCellMar>
-            <w:top w:w="0" w:type="dxa"/>
-            <w:bottom w:w="0" w:type="dxa"/>
-          </w:tblCellMar>
-        </w:tblPrEx>
         <w:tc>
           <w:tcPr>
             <w:tcW w:w="2600" w:type="dxa"/>
@@ -11573,12 +10796,6 @@
         </w:tc>
       </w:tr>
       <w:tr>
-        <w:tblPrEx>
-          <w:tblCellMar>
-            <w:top w:w="0" w:type="dxa"/>
-            <w:bottom w:w="0" w:type="dxa"/>
-          </w:tblCellMar>
-        </w:tblPrEx>
         <w:tc>
           <w:tcPr>
             <w:tcW w:w="2600" w:type="dxa"/>
@@ -11637,12 +10854,6 @@
         </w:tc>
       </w:tr>
       <w:tr>
-        <w:tblPrEx>
-          <w:tblCellMar>
-            <w:top w:w="0" w:type="dxa"/>
-            <w:bottom w:w="0" w:type="dxa"/>
-          </w:tblCellMar>
-        </w:tblPrEx>
         <w:tc>
           <w:tcPr>
             <w:tcW w:w="2600" w:type="dxa"/>
@@ -11701,12 +10912,6 @@
         </w:tc>
       </w:tr>
       <w:tr>
-        <w:tblPrEx>
-          <w:tblCellMar>
-            <w:top w:w="0" w:type="dxa"/>
-            <w:bottom w:w="0" w:type="dxa"/>
-          </w:tblCellMar>
-        </w:tblPrEx>
         <w:tc>
           <w:tcPr>
             <w:tcW w:w="2600" w:type="dxa"/>
@@ -11765,12 +10970,6 @@
         </w:tc>
       </w:tr>
       <w:tr>
-        <w:tblPrEx>
-          <w:tblCellMar>
-            <w:top w:w="0" w:type="dxa"/>
-            <w:bottom w:w="0" w:type="dxa"/>
-          </w:tblCellMar>
-        </w:tblPrEx>
         <w:tc>
           <w:tcPr>
             <w:tcW w:w="2600" w:type="dxa"/>
@@ -11830,12 +11029,6 @@
         </w:tc>
       </w:tr>
       <w:tr>
-        <w:tblPrEx>
-          <w:tblCellMar>
-            <w:top w:w="0" w:type="dxa"/>
-            <w:bottom w:w="0" w:type="dxa"/>
-          </w:tblCellMar>
-        </w:tblPrEx>
         <w:tc>
           <w:tcPr>
             <w:tcW w:w="2600" w:type="dxa"/>
@@ -11894,12 +11087,6 @@
         </w:tc>
       </w:tr>
       <w:tr>
-        <w:tblPrEx>
-          <w:tblCellMar>
-            <w:top w:w="0" w:type="dxa"/>
-            <w:bottom w:w="0" w:type="dxa"/>
-          </w:tblCellMar>
-        </w:tblPrEx>
         <w:tc>
           <w:tcPr>
             <w:tcW w:w="2600" w:type="dxa"/>
@@ -11958,12 +11145,6 @@
         </w:tc>
       </w:tr>
       <w:tr>
-        <w:tblPrEx>
-          <w:tblCellMar>
-            <w:top w:w="0" w:type="dxa"/>
-            <w:bottom w:w="0" w:type="dxa"/>
-          </w:tblCellMar>
-        </w:tblPrEx>
         <w:tc>
           <w:tcPr>
             <w:tcW w:w="2600" w:type="dxa"/>
@@ -12034,13 +11215,8 @@
           <w:bottom w:val="single" w:sz="6" w:space="4" w:color="2563EB"/>
         </w:pBdr>
       </w:pPr>
-      <w:proofErr w:type="gramStart"/>
       <w:r>
-        <w:t>6.2  Test</w:t>
-      </w:r>
-      <w:proofErr w:type="gramEnd"/>
-      <w:r>
-        <w:t xml:space="preserve"> Sequencing &amp; Rollout Plan</w:t>
+        <w:t>6.2  Test Sequencing &amp; Rollout Plan</w:t>
       </w:r>
     </w:p>
     <w:tbl>
@@ -12067,12 +11243,6 @@
         <w:gridCol w:w="2591"/>
       </w:tblGrid>
       <w:tr>
-        <w:tblPrEx>
-          <w:tblCellMar>
-            <w:top w:w="0" w:type="dxa"/>
-            <w:bottom w:w="0" w:type="dxa"/>
-          </w:tblCellMar>
-        </w:tblPrEx>
         <w:trPr>
           <w:tblHeader/>
         </w:trPr>
@@ -12210,12 +11380,6 @@
         </w:tc>
       </w:tr>
       <w:tr>
-        <w:tblPrEx>
-          <w:tblCellMar>
-            <w:top w:w="0" w:type="dxa"/>
-            <w:bottom w:w="0" w:type="dxa"/>
-          </w:tblCellMar>
-        </w:tblPrEx>
         <w:tc>
           <w:tcPr>
             <w:tcW w:w="900" w:type="dxa"/>
@@ -12330,12 +11494,6 @@
         </w:tc>
       </w:tr>
       <w:tr>
-        <w:tblPrEx>
-          <w:tblCellMar>
-            <w:top w:w="0" w:type="dxa"/>
-            <w:bottom w:w="0" w:type="dxa"/>
-          </w:tblCellMar>
-        </w:tblPrEx>
         <w:tc>
           <w:tcPr>
             <w:tcW w:w="900" w:type="dxa"/>
@@ -12450,12 +11608,6 @@
         </w:tc>
       </w:tr>
       <w:tr>
-        <w:tblPrEx>
-          <w:tblCellMar>
-            <w:top w:w="0" w:type="dxa"/>
-            <w:bottom w:w="0" w:type="dxa"/>
-          </w:tblCellMar>
-        </w:tblPrEx>
         <w:tc>
           <w:tcPr>
             <w:tcW w:w="900" w:type="dxa"/>
@@ -12570,12 +11722,6 @@
         </w:tc>
       </w:tr>
       <w:tr>
-        <w:tblPrEx>
-          <w:tblCellMar>
-            <w:top w:w="0" w:type="dxa"/>
-            <w:bottom w:w="0" w:type="dxa"/>
-          </w:tblCellMar>
-        </w:tblPrEx>
         <w:tc>
           <w:tcPr>
             <w:tcW w:w="900" w:type="dxa"/>
@@ -12716,12 +11862,6 @@
         <w:gridCol w:w="9360"/>
       </w:tblGrid>
       <w:tr>
-        <w:tblPrEx>
-          <w:tblCellMar>
-            <w:top w:w="0" w:type="dxa"/>
-            <w:bottom w:w="0" w:type="dxa"/>
-          </w:tblCellMar>
-        </w:tblPrEx>
         <w:tc>
           <w:tcPr>
             <w:tcW w:w="9360" w:type="dxa"/>
@@ -12769,13 +11909,8 @@
           <w:bottom w:val="single" w:sz="6" w:space="4" w:color="2563EB"/>
         </w:pBdr>
       </w:pPr>
-      <w:proofErr w:type="gramStart"/>
       <w:r>
-        <w:t>7.1  Summary</w:t>
-      </w:r>
-      <w:proofErr w:type="gramEnd"/>
-      <w:r>
-        <w:t xml:space="preserve"> of Findings</w:t>
+        <w:t>7.1  Summary of Findings</w:t>
       </w:r>
     </w:p>
     <w:tbl>
@@ -12801,12 +11936,6 @@
         <w:gridCol w:w="4060"/>
       </w:tblGrid>
       <w:tr>
-        <w:tblPrEx>
-          <w:tblCellMar>
-            <w:top w:w="0" w:type="dxa"/>
-            <w:bottom w:w="0" w:type="dxa"/>
-          </w:tblCellMar>
-        </w:tblPrEx>
         <w:trPr>
           <w:tblHeader/>
         </w:trPr>
@@ -12911,12 +12040,6 @@
         </w:tc>
       </w:tr>
       <w:tr>
-        <w:tblPrEx>
-          <w:tblCellMar>
-            <w:top w:w="0" w:type="dxa"/>
-            <w:bottom w:w="0" w:type="dxa"/>
-          </w:tblCellMar>
-        </w:tblPrEx>
         <w:tc>
           <w:tcPr>
             <w:tcW w:w="2300" w:type="dxa"/>
@@ -13003,12 +12126,6 @@
         </w:tc>
       </w:tr>
       <w:tr>
-        <w:tblPrEx>
-          <w:tblCellMar>
-            <w:top w:w="0" w:type="dxa"/>
-            <w:bottom w:w="0" w:type="dxa"/>
-          </w:tblCellMar>
-        </w:tblPrEx>
         <w:tc>
           <w:tcPr>
             <w:tcW w:w="2300" w:type="dxa"/>
@@ -13095,12 +12212,6 @@
         </w:tc>
       </w:tr>
       <w:tr>
-        <w:tblPrEx>
-          <w:tblCellMar>
-            <w:top w:w="0" w:type="dxa"/>
-            <w:bottom w:w="0" w:type="dxa"/>
-          </w:tblCellMar>
-        </w:tblPrEx>
         <w:tc>
           <w:tcPr>
             <w:tcW w:w="2300" w:type="dxa"/>
@@ -13187,12 +12298,6 @@
         </w:tc>
       </w:tr>
       <w:tr>
-        <w:tblPrEx>
-          <w:tblCellMar>
-            <w:top w:w="0" w:type="dxa"/>
-            <w:bottom w:w="0" w:type="dxa"/>
-          </w:tblCellMar>
-        </w:tblPrEx>
         <w:tc>
           <w:tcPr>
             <w:tcW w:w="2300" w:type="dxa"/>
@@ -13279,12 +12384,6 @@
         </w:tc>
       </w:tr>
       <w:tr>
-        <w:tblPrEx>
-          <w:tblCellMar>
-            <w:top w:w="0" w:type="dxa"/>
-            <w:bottom w:w="0" w:type="dxa"/>
-          </w:tblCellMar>
-        </w:tblPrEx>
         <w:tc>
           <w:tcPr>
             <w:tcW w:w="2300" w:type="dxa"/>
@@ -13419,13 +12518,8 @@
           <w:bottom w:val="single" w:sz="6" w:space="4" w:color="2563EB"/>
         </w:pBdr>
       </w:pPr>
-      <w:proofErr w:type="gramStart"/>
       <w:r>
-        <w:t>7.2  Metric</w:t>
-      </w:r>
-      <w:proofErr w:type="gramEnd"/>
-      <w:r>
-        <w:t xml:space="preserve"> Goals</w:t>
+        <w:t>7.2  Metric Goals</w:t>
       </w:r>
     </w:p>
     <w:tbl>
@@ -13452,12 +12546,6 @@
         <w:gridCol w:w="2760"/>
       </w:tblGrid>
       <w:tr>
-        <w:tblPrEx>
-          <w:tblCellMar>
-            <w:top w:w="0" w:type="dxa"/>
-            <w:bottom w:w="0" w:type="dxa"/>
-          </w:tblCellMar>
-        </w:tblPrEx>
         <w:trPr>
           <w:tblHeader/>
         </w:trPr>
@@ -13595,12 +12683,6 @@
         </w:tc>
       </w:tr>
       <w:tr>
-        <w:tblPrEx>
-          <w:tblCellMar>
-            <w:top w:w="0" w:type="dxa"/>
-            <w:bottom w:w="0" w:type="dxa"/>
-          </w:tblCellMar>
-        </w:tblPrEx>
         <w:tc>
           <w:tcPr>
             <w:tcW w:w="2800" w:type="dxa"/>
@@ -13715,12 +12797,6 @@
         </w:tc>
       </w:tr>
       <w:tr>
-        <w:tblPrEx>
-          <w:tblCellMar>
-            <w:top w:w="0" w:type="dxa"/>
-            <w:bottom w:w="0" w:type="dxa"/>
-          </w:tblCellMar>
-        </w:tblPrEx>
         <w:tc>
           <w:tcPr>
             <w:tcW w:w="2800" w:type="dxa"/>
@@ -13835,12 +12911,6 @@
         </w:tc>
       </w:tr>
       <w:tr>
-        <w:tblPrEx>
-          <w:tblCellMar>
-            <w:top w:w="0" w:type="dxa"/>
-            <w:bottom w:w="0" w:type="dxa"/>
-          </w:tblCellMar>
-        </w:tblPrEx>
         <w:tc>
           <w:tcPr>
             <w:tcW w:w="2800" w:type="dxa"/>
@@ -13955,12 +13025,6 @@
         </w:tc>
       </w:tr>
       <w:tr>
-        <w:tblPrEx>
-          <w:tblCellMar>
-            <w:top w:w="0" w:type="dxa"/>
-            <w:bottom w:w="0" w:type="dxa"/>
-          </w:tblCellMar>
-        </w:tblPrEx>
         <w:tc>
           <w:tcPr>
             <w:tcW w:w="2800" w:type="dxa"/>
@@ -14075,12 +13139,6 @@
         </w:tc>
       </w:tr>
       <w:tr>
-        <w:tblPrEx>
-          <w:tblCellMar>
-            <w:top w:w="0" w:type="dxa"/>
-            <w:bottom w:w="0" w:type="dxa"/>
-          </w:tblCellMar>
-        </w:tblPrEx>
         <w:tc>
           <w:tcPr>
             <w:tcW w:w="2800" w:type="dxa"/>
@@ -14195,12 +13253,6 @@
         </w:tc>
       </w:tr>
       <w:tr>
-        <w:tblPrEx>
-          <w:tblCellMar>
-            <w:top w:w="0" w:type="dxa"/>
-            <w:bottom w:w="0" w:type="dxa"/>
-          </w:tblCellMar>
-        </w:tblPrEx>
         <w:tc>
           <w:tcPr>
             <w:tcW w:w="2800" w:type="dxa"/>
@@ -14327,13 +13379,8 @@
           <w:bottom w:val="single" w:sz="6" w:space="4" w:color="2563EB"/>
         </w:pBdr>
       </w:pPr>
-      <w:proofErr w:type="gramStart"/>
       <w:r>
-        <w:t>7.3  What</w:t>
-      </w:r>
-      <w:proofErr w:type="gramEnd"/>
-      <w:r>
-        <w:t xml:space="preserve"> This Project Demonstrates</w:t>
+        <w:t>7.3  What This Project Demonstrates</w:t>
       </w:r>
     </w:p>
     <w:p>
@@ -14377,21 +13424,7 @@
           <w:color w:val="374151"/>
         </w:rPr>
         <w:lastRenderedPageBreak/>
-        <w:t xml:space="preserve">Product thinking: distinguishing what </w:t>
-      </w:r>
-      <w:proofErr w:type="spellStart"/>
-      <w:r>
-        <w:rPr>
-          <w:color w:val="374151"/>
-        </w:rPr>
-        <w:t>Shiprocket</w:t>
-      </w:r>
-      <w:proofErr w:type="spellEnd"/>
-      <w:r>
-        <w:rPr>
-          <w:color w:val="374151"/>
-        </w:rPr>
-        <w:t xml:space="preserve"> can actually build (checkout/delivery-layer features) from what it cannot (seller content quality on external storefronts)</w:t>
+        <w:t>Product thinking: distinguishing what Shiprocket can actually build (checkout/delivery-layer features) from what it cannot (seller content quality on external storefronts)</w:t>
       </w:r>
     </w:p>
     <w:p>
@@ -14484,12 +13517,6 @@
         <w:gridCol w:w="9360"/>
       </w:tblGrid>
       <w:tr>
-        <w:tblPrEx>
-          <w:tblCellMar>
-            <w:top w:w="0" w:type="dxa"/>
-            <w:bottom w:w="0" w:type="dxa"/>
-          </w:tblCellMar>
-        </w:tblPrEx>
         <w:tc>
           <w:tcPr>
             <w:tcW w:w="9360" w:type="dxa"/>
@@ -14527,25 +13554,7 @@
                 <w:sz w:val="21"/>
                 <w:szCs w:val="21"/>
               </w:rPr>
-              <w:t xml:space="preserve">1. What is the actual COD RTO rate by </w:t>
-            </w:r>
-            <w:proofErr w:type="spellStart"/>
-            <w:r>
-              <w:rPr>
-                <w:color w:val="374151"/>
-                <w:sz w:val="21"/>
-                <w:szCs w:val="21"/>
-              </w:rPr>
-              <w:t>Shiprocket</w:t>
-            </w:r>
-            <w:proofErr w:type="spellEnd"/>
-            <w:r>
-              <w:rPr>
-                <w:color w:val="374151"/>
-                <w:sz w:val="21"/>
-                <w:szCs w:val="21"/>
-              </w:rPr>
-              <w:t xml:space="preserve"> seller vertical? (Would allow calibration of the risk-score multipliers beyond the simulated estimates.) 2. Does the pre-delivery call currently happen before or after the courier leaves the hub? (Determines whether Test 2 requires a process change or only a notification-timing change.) 3. What is the current NDR reattempt SLA across </w:t>
+              <w:t xml:space="preserve">1. What is the actual COD RTO rate by Shiprocket seller vertical? (Would allow calibration of the risk-score multipliers beyond the simulated estimates.) 2. Does the pre-delivery call currently happen before or after the courier leaves the hub? (Determines whether Test 2 requires a process change or only a notification-timing change.) 3. What is the current NDR reattempt SLA across </w:t>
             </w:r>
             <w:proofErr w:type="spellStart"/>
             <w:r>
@@ -14605,18 +13614,8 @@
           <w:sz w:val="20"/>
           <w:szCs w:val="20"/>
         </w:rPr>
-        <w:t xml:space="preserve">Product </w:t>
+        <w:t xml:space="preserve">Product Analyst  </w:t>
       </w:r>
-      <w:proofErr w:type="gramStart"/>
-      <w:r>
-        <w:rPr>
-          <w:color w:val="6B7280"/>
-          <w:sz w:val="20"/>
-          <w:szCs w:val="20"/>
-        </w:rPr>
-        <w:t xml:space="preserve">Analyst  </w:t>
-      </w:r>
-      <w:proofErr w:type="gramEnd"/>
     </w:p>
     <w:sectPr>
       <w:headerReference w:type="default" r:id="rId7"/>
@@ -14724,34 +13723,7 @@
         <w:sz w:val="18"/>
         <w:szCs w:val="18"/>
       </w:rPr>
-      <w:t xml:space="preserve">RTO &amp; NDR Intelligence </w:t>
-    </w:r>
-    <w:proofErr w:type="gramStart"/>
-    <w:r>
-      <w:rPr>
-        <w:color w:val="6B7280"/>
-        <w:sz w:val="18"/>
-        <w:szCs w:val="18"/>
-      </w:rPr>
-      <w:t>Framework  |</w:t>
-    </w:r>
-    <w:proofErr w:type="gramEnd"/>
-    <w:r>
-      <w:rPr>
-        <w:color w:val="6B7280"/>
-        <w:sz w:val="18"/>
-        <w:szCs w:val="18"/>
-      </w:rPr>
-      <w:t xml:space="preserve">  Devesh </w:t>
-    </w:r>
-    <w:proofErr w:type="gramStart"/>
-    <w:r>
-      <w:rPr>
-        <w:color w:val="6B7280"/>
-        <w:sz w:val="18"/>
-        <w:szCs w:val="18"/>
-      </w:rPr>
-      <w:t>Dwivedi</w:t>
+      <w:t>RTO &amp; NDR Intelligence Framework  |  Devesh Dwivedi</w:t>
     </w:r>
     <w:r>
       <w:rPr>
@@ -14759,34 +13731,7 @@
         <w:sz w:val="18"/>
         <w:szCs w:val="18"/>
       </w:rPr>
-      <w:t xml:space="preserve">  —</w:t>
-    </w:r>
-    <w:proofErr w:type="gramEnd"/>
-    <w:r>
-      <w:rPr>
-        <w:color w:val="2563EB"/>
-        <w:sz w:val="18"/>
-        <w:szCs w:val="18"/>
-      </w:rPr>
-      <w:t xml:space="preserve">  </w:t>
-    </w:r>
-    <w:proofErr w:type="spellStart"/>
-    <w:r>
-      <w:rPr>
-        <w:color w:val="2563EB"/>
-        <w:sz w:val="18"/>
-        <w:szCs w:val="18"/>
-      </w:rPr>
-      <w:t>Shiprocket</w:t>
-    </w:r>
-    <w:proofErr w:type="spellEnd"/>
-    <w:r>
-      <w:rPr>
-        <w:color w:val="2563EB"/>
-        <w:sz w:val="18"/>
-        <w:szCs w:val="18"/>
-      </w:rPr>
-      <w:t xml:space="preserve"> Product Analytics</w:t>
+      <w:t xml:space="preserve">  —  Shiprocket Product Analytics</w:t>
     </w:r>
   </w:p>
 </w:hdr>

</xml_diff>